<commit_message>
Record the hosted battery honestly and guard the demo quota
The hosted sweep throttled again before its scam controls ran, so it has never
produced a complete run. Rather than let that read as a hidden failure, the run
log, the brief and the checklist now say what happened, point at the single
observed live call as the only hosted evidence, and stop anyone spending the
free daily quota on dev checks hours before the demo depends on it.
</commit_message>
<xml_diff>
--- a/pitch/Shotorko-Presenter-Brief.docx
+++ b/pitch/Shotorko-Presenter-Brief.docx
@@ -3553,7 +3553,7 @@
               <w:rPr>
                 <w:sz w:val="19"/>
               </w:rPr>
-              <w:t>—</w:t>
+              <w:t>255</w:t>
             </w:r>
           </w:p>
         </w:tc>
@@ -3627,7 +3627,7 @@
               <w:rPr>
                 <w:sz w:val="19"/>
               </w:rPr>
-              <w:t>functions/*.ts,.mjs</w:t>
+              <w:t>functions/*.ts + cloud-agents.mjs</w:t>
             </w:r>
           </w:p>
         </w:tc>
@@ -3641,7 +3641,7 @@
               <w:rPr>
                 <w:sz w:val="19"/>
               </w:rPr>
-              <w:t>372</w:t>
+              <w:t>372 + 269</w:t>
             </w:r>
           </w:p>
         </w:tc>
@@ -4439,7 +4439,21 @@
           <w:i w:val="0"/>
           <w:sz w:val="20"/>
         </w:rPr>
-        <w:t>All six offline checks pass as of today: engine ALL CHECKS PASSED, backend 69/69, functions 24/24, battery benign 0/10 calm · 1/10 hostile · scams 4/5, deck layout clean over 216 text blocks, and https://abukawser.xyz/functions/v1/app/health answering with the live model.</w:t>
+        <w:t>Every check that backs a number on a slide passes offline, and offline is what slide 7 quotes: engine ALL CHECKS PASSED, backend 69/69, functions 24/24, the same 15-sentence sweep giving benign 0/10 calm · 1/10 hostile · scams 4/5, deck layout clean over 216 text blocks, and https://abukawser.xyz/functions/v1/app/health answering with the live model.</w:t>
+      </w:r>
+    </w:p>
+    <w:p>
+      <w:pPr>
+        <w:spacing w:after="100"/>
+      </w:pPr>
+      <w:r>
+        <w:rPr>
+          <w:b w:val="0"/>
+          <w:i w:val="0"/>
+          <w:color w:val="5A5A5A"/>
+          <w:sz w:val="20"/>
+        </w:rPr>
+        <w:t>The one thing that has never completed is the identical sweep against the hosted engine. Re-run this night it paused 0/10 calm and 1/10 hostile, then Google's daily free quota cut it off with HTTP 429 before any scam control ran. That is a quota artifact and never a classifier result — which is exactly why the slides quote the offline engine, the one that re-runs identically with no network at all. If a judge asks for hosted evidence, use the single observed console call on slide 7 (risk 95/100, engine live) and describe it as one observed call.</w:t>
       </w:r>
     </w:p>
     <w:p>
@@ -7230,7 +7244,7 @@
         <w:rPr>
           <w:b w:val="0"/>
         </w:rPr>
-        <w:t>Google's free Gemini quota may already be exhausted tomorrow. If it is, /health still answers, the Live agent toggle still appears, and every call falls back to the on-device engine with a small fallback note. The deck's numbers are the on-device ones precisely because they re-run identically anywhere. Do not present a throttled result as a classifier result.</w:t>
+        <w:t>Google's free Gemini quota was already throttling last night — the hosted sweep stopped at HTTP 429 before the scam controls ran, so the hosted battery has never completed. Re-checked at 02:20 on 17 Oct: the hosted path answers (one analyze call, risk 95, engine live), so it may well work on stage — but a free daily quota can empty mid-demo. If it does: /health still answers, the Live agent toggle still appears, and every call falls back to the on-device engine with a small note. That is the behaviour the deck claims, not a failure. Say 'the hosted model is behind a free daily quota, so what you are watching is the on-device engine' — never a throttled run as a classifier result.</w:t>
       </w:r>
     </w:p>
     <w:p>
@@ -7290,7 +7304,7 @@
         <w:rPr>
           <w:b w:val="0"/>
         </w:rPr>
-        <w:t>Nothing in the repo contains a secret: .env* is git-ignored and excluded from the deploy, and QODER_PAT is a platform Secret only. Keep it that way if you push tonight.</w:t>
+        <w:t>Nothing in the repo contains a secret: .env* is git-ignored and excluded from the deploy, and QODER_PAT is a platform Secret only — true of the pushed state as of this build.</w:t>
       </w:r>
     </w:p>
     <w:p>
@@ -7389,7 +7403,7 @@
               <w:rPr>
                 <w:sz w:val="19"/>
               </w:rPr>
-              <w:t>python3 dev/render-pptx.py on the submitted .pptx — the last line must read “clean over 216 text blocks”</w:t>
+              <w:t>Run no hosted check before you present. dev/false-positive-battery.mjs &lt;url&gt; and dev/live-probe.mjs spend the same free daily quota the Live agent toggle depends on. Leave the engine on On-device until you are on stage, and switch to Live agent once, early</w:t>
             </w:r>
           </w:p>
         </w:tc>
@@ -7403,7 +7417,7 @@
               <w:rPr>
                 <w:sz w:val="19"/>
               </w:rPr>
-              <w:t>2 min</w:t>
+              <w:t>—</w:t>
             </w:r>
           </w:p>
         </w:tc>
@@ -7433,7 +7447,7 @@
               <w:rPr>
                 <w:sz w:val="19"/>
               </w:rPr>
-              <w:t>Open the .pptx and flip through all 13 pages once; check the fonts render Bangla on your machine</w:t>
+              <w:t>python3 dev/render-pptx.py on the submitted .pptx — the last line must read “clean over 216 text blocks”</w:t>
             </w:r>
           </w:p>
         </w:tc>
@@ -7447,7 +7461,7 @@
               <w:rPr>
                 <w:sz w:val="19"/>
               </w:rPr>
-              <w:t>3 min</w:t>
+              <w:t>2 min</w:t>
             </w:r>
           </w:p>
         </w:tc>
@@ -7477,7 +7491,7 @@
               <w:rPr>
                 <w:sz w:val="19"/>
               </w:rPr>
-              <w:t>node dev/engine-check.js &amp;&amp; node dev/backend-check.mjs — both must pass</w:t>
+              <w:t>Open the .pptx and flip through all 13 pages once; check the fonts render Bangla on your machine</w:t>
             </w:r>
           </w:p>
         </w:tc>
@@ -7491,7 +7505,7 @@
               <w:rPr>
                 <w:sz w:val="19"/>
               </w:rPr>
-              <w:t>1 min</w:t>
+              <w:t>3 min</w:t>
             </w:r>
           </w:p>
         </w:tc>
@@ -7521,7 +7535,7 @@
               <w:rPr>
                 <w:sz w:val="19"/>
               </w:rPr>
-              <w:t>Open abukawser.xyz on your phone, press ⟲ Reset then ▶ Play the story, end to end</w:t>
+              <w:t>node dev/engine-check.js &amp;&amp; node dev/backend-check.mjs — both must pass</w:t>
             </w:r>
           </w:p>
         </w:tc>
@@ -7535,7 +7549,7 @@
               <w:rPr>
                 <w:sz w:val="19"/>
               </w:rPr>
-              <w:t>2 min</w:t>
+              <w:t>1 min</w:t>
             </w:r>
           </w:p>
         </w:tc>
@@ -7565,7 +7579,7 @@
               <w:rPr>
                 <w:sz w:val="19"/>
               </w:rPr>
-              <w:t>Type a scam line you were actually sent into নিজে যাচাই and read the result aloud — this is the demo you will repeat on stage</w:t>
+              <w:t>Open abukawser.xyz on your phone, press ⟲ Reset then ▶ Play the story, end to end</w:t>
             </w:r>
           </w:p>
         </w:tc>
@@ -7609,7 +7623,7 @@
               <w:rPr>
                 <w:sz w:val="19"/>
               </w:rPr>
-              <w:t>Scan the QR from a phone on the venue network</w:t>
+              <w:t>Type a scam line you were actually sent into নিজে যাচাই and read the result aloud — this is the demo you will repeat on stage</w:t>
             </w:r>
           </w:p>
         </w:tc>
@@ -7623,7 +7637,7 @@
               <w:rPr>
                 <w:sz w:val="19"/>
               </w:rPr>
-              <w:t>30 sec</w:t>
+              <w:t>2 min</w:t>
             </w:r>
           </w:p>
         </w:tc>
@@ -7653,7 +7667,7 @@
               <w:rPr>
                 <w:sz w:val="19"/>
               </w:rPr>
-              <w:t>Confirm Shotorko_Video_Pitch.mp4 plays on the presentation laptop, muted</w:t>
+              <w:t>Scan the QR from a phone on the venue network</w:t>
             </w:r>
           </w:p>
         </w:tc>
@@ -7667,7 +7681,7 @@
               <w:rPr>
                 <w:sz w:val="19"/>
               </w:rPr>
-              <w:t>1 min</w:t>
+              <w:t>30 sec</w:t>
             </w:r>
           </w:p>
         </w:tc>
@@ -7697,7 +7711,7 @@
               <w:rPr>
                 <w:sz w:val="19"/>
               </w:rPr>
-              <w:t>Say the open line and the close line out loud, then the four asks on slide 10 in order</w:t>
+              <w:t>Confirm Shotorko_Video_Pitch.mp4 plays on the presentation laptop, muted</w:t>
             </w:r>
           </w:p>
         </w:tc>
@@ -7711,7 +7725,7 @@
               <w:rPr>
                 <w:sz w:val="19"/>
               </w:rPr>
-              <w:t>3 min</w:t>
+              <w:t>1 min</w:t>
             </w:r>
           </w:p>
         </w:tc>
@@ -7741,7 +7755,7 @@
               <w:rPr>
                 <w:sz w:val="19"/>
               </w:rPr>
-              <w:t>Re-read section 9 above — the honest limits are your strongest material, not your weakest</w:t>
+              <w:t>Say the open line and the close line out loud, then the four asks on slide 10 in order</w:t>
             </w:r>
           </w:p>
         </w:tc>
@@ -7755,7 +7769,7 @@
               <w:rPr>
                 <w:sz w:val="19"/>
               </w:rPr>
-              <w:t>5 min</w:t>
+              <w:t>3 min</w:t>
             </w:r>
           </w:p>
         </w:tc>
@@ -7785,7 +7799,51 @@
               <w:rPr>
                 <w:sz w:val="19"/>
               </w:rPr>
-              <w:t>The deck is already submitted — treat that .pptx as frozen. If you change anything tonight, run python3 dev/build-brief.py after it, so this document still matches what is on screen</w:t>
+              <w:t>Re-read section 9 above — the honest limits are your strongest material, not your weakest</w:t>
+            </w:r>
+          </w:p>
+        </w:tc>
+        <w:tc>
+          <w:tcPr>
+            <w:tcW w:type="dxa" w:w="1440"/>
+          </w:tcPr>
+          <w:p>
+            <w:r/>
+            <w:r>
+              <w:rPr>
+                <w:sz w:val="19"/>
+              </w:rPr>
+              <w:t>5 min</w:t>
+            </w:r>
+          </w:p>
+        </w:tc>
+      </w:tr>
+      <w:tr>
+        <w:tc>
+          <w:tcPr>
+            <w:tcW w:type="dxa" w:w="504"/>
+          </w:tcPr>
+          <w:p>
+            <w:r/>
+            <w:r>
+              <w:rPr>
+                <w:sz w:val="19"/>
+              </w:rPr>
+              <w:t>11</w:t>
+            </w:r>
+          </w:p>
+        </w:tc>
+        <w:tc>
+          <w:tcPr>
+            <w:tcW w:type="dxa" w:w="8064"/>
+          </w:tcPr>
+          <w:p>
+            <w:r/>
+            <w:r>
+              <w:rPr>
+                <w:sz w:val="19"/>
+              </w:rPr>
+              <w:t>The deck is already submitted — treat that .pptx as frozen. If you change anything before the pitch, run python3 dev/build-brief.py after it, so this document still matches what is on screen</w:t>
             </w:r>
           </w:p>
         </w:tc>

</xml_diff>